<commit_message>
some lab changes: 2025-06-09 23:37:59
</commit_message>
<xml_diff>
--- a/Курс 2/Теория автоматов/ОТВЕТЫ НА ЗАЧЕТ ПО ТЕОРИИ АВТОМАТОВ ДЛЯ СПИСЫВАНИЯ, НЕ СМОТРЕТЬ!!!.docx
+++ b/Курс 2/Теория автоматов/ОТВЕТЫ НА ЗАЧЕТ ПО ТЕОРИИ АВТОМАТОВ ДЛЯ СПИСЫВАНИЯ, НЕ СМОТРЕТЬ!!!.docx
@@ -1,6 +1,6 @@
 
 <file path=word/document.xml><?xml version="1.0" encoding="utf-8"?>
-<w:document xmlns:wpc="http://schemas.microsoft.com/office/word/2010/wordprocessingCanvas" xmlns:cx="http://schemas.microsoft.com/office/drawing/2014/chartex" xmlns:mc="http://schemas.openxmlformats.org/markup-compatibility/2006" xmlns:o="urn:schemas-microsoft-com:office:office" xmlns:r="http://schemas.openxmlformats.org/officeDocument/2006/relationships" xmlns:m="http://schemas.openxmlformats.org/officeDocument/2006/math" xmlns:v="urn:schemas-microsoft-com:vml" xmlns:wp14="http://schemas.microsoft.com/office/word/2010/wordprocessingDrawing" xmlns:wp="http://schemas.openxmlformats.org/drawingml/2006/wordprocessingDrawing" xmlns:w10="urn:schemas-microsoft-com:office:word" xmlns:w="http://schemas.openxmlformats.org/wordprocessingml/2006/main" xmlns:w14="http://schemas.microsoft.com/office/word/2010/wordml" xmlns:w15="http://schemas.microsoft.com/office/word/2012/wordml" xmlns:w16se="http://schemas.microsoft.com/office/word/2015/wordml/symex" xmlns:wpg="http://schemas.microsoft.com/office/word/2010/wordprocessingGroup" xmlns:wpi="http://schemas.microsoft.com/office/word/2010/wordprocessingInk" xmlns:wne="http://schemas.microsoft.com/office/word/2006/wordml" xmlns:wps="http://schemas.microsoft.com/office/word/2010/wordprocessingShape" mc:Ignorable="w14 w15 w16se wp14">
+<w:document xmlns:wpc="http://schemas.microsoft.com/office/word/2010/wordprocessingCanvas" xmlns:cx="http://schemas.microsoft.com/office/drawing/2014/chartex" xmlns:cx1="http://schemas.microsoft.com/office/drawing/2015/9/8/chartex" xmlns:cx2="http://schemas.microsoft.com/office/drawing/2015/10/21/chartex" xmlns:cx3="http://schemas.microsoft.com/office/drawing/2016/5/9/chartex" xmlns:cx4="http://schemas.microsoft.com/office/drawing/2016/5/10/chartex" xmlns:cx5="http://schemas.microsoft.com/office/drawing/2016/5/11/chartex" xmlns:cx6="http://schemas.microsoft.com/office/drawing/2016/5/12/chartex" xmlns:cx7="http://schemas.microsoft.com/office/drawing/2016/5/13/chartex" xmlns:cx8="http://schemas.microsoft.com/office/drawing/2016/5/14/chartex" xmlns:mc="http://schemas.openxmlformats.org/markup-compatibility/2006" xmlns:aink="http://schemas.microsoft.com/office/drawing/2016/ink" xmlns:am3d="http://schemas.microsoft.com/office/drawing/2017/model3d" xmlns:o="urn:schemas-microsoft-com:office:office" xmlns:oel="http://schemas.microsoft.com/office/2019/extlst" xmlns:r="http://schemas.openxmlformats.org/officeDocument/2006/relationships" xmlns:m="http://schemas.openxmlformats.org/officeDocument/2006/math" xmlns:v="urn:schemas-microsoft-com:vml" xmlns:wp14="http://schemas.microsoft.com/office/word/2010/wordprocessingDrawing" xmlns:wp="http://schemas.openxmlformats.org/drawingml/2006/wordprocessingDrawing" xmlns:w10="urn:schemas-microsoft-com:office:word" xmlns:w="http://schemas.openxmlformats.org/wordprocessingml/2006/main" xmlns:w14="http://schemas.microsoft.com/office/word/2010/wordml" xmlns:w15="http://schemas.microsoft.com/office/word/2012/wordml" xmlns:w16cex="http://schemas.microsoft.com/office/word/2018/wordml/cex" xmlns:w16cid="http://schemas.microsoft.com/office/word/2016/wordml/cid" xmlns:w16="http://schemas.microsoft.com/office/word/2018/wordml" xmlns:w16du="http://schemas.microsoft.com/office/word/2023/wordml/word16du" xmlns:w16sdtdh="http://schemas.microsoft.com/office/word/2020/wordml/sdtdatahash" xmlns:w16sdtfl="http://schemas.microsoft.com/office/word/2024/wordml/sdtformatlock" xmlns:w16se="http://schemas.microsoft.com/office/word/2015/wordml/symex" xmlns:wpg="http://schemas.microsoft.com/office/word/2010/wordprocessingGroup" xmlns:wpi="http://schemas.microsoft.com/office/word/2010/wordprocessingInk" xmlns:wne="http://schemas.microsoft.com/office/word/2006/wordml" xmlns:wps="http://schemas.microsoft.com/office/word/2010/wordprocessingShape" mc:Ignorable="w14 w15 w16se w16cid w16 w16cex w16sdtdh w16sdtfl w16du wp14">
   <w:body>
     <w:p>
       <w:pPr>
@@ -338,7 +338,6 @@
         </w:rPr>
         <w:t>S</w:t>
       </w:r>
-      <w:proofErr w:type="gramStart"/>
       <w:r>
         <w:rPr>
           <w:rFonts w:ascii="Times New Roman" w:hAnsi="Times New Roman" w:cs="Times New Roman"/>
@@ -360,7 +359,6 @@
         </w:rPr>
         <w:t>S</w:t>
       </w:r>
-      <w:proofErr w:type="gramEnd"/>
       <w:r>
         <w:rPr>
           <w:rFonts w:ascii="Times New Roman" w:hAnsi="Times New Roman" w:cs="Times New Roman"/>
@@ -1378,19 +1376,460 @@
           <w:szCs w:val="24"/>
           <w:shd w:val="clear" w:color="auto" w:fill="FFFFFF"/>
         </w:rPr>
+        <w:t xml:space="preserve"> ( </w:t>
+      </w:r>
+      <w:r>
+        <w:rPr>
+          <w:rFonts w:ascii="Times New Roman" w:hAnsi="Times New Roman" w:cs="Times New Roman"/>
+          <w:b/>
+          <w:color w:val="333333"/>
+          <w:sz w:val="24"/>
+          <w:szCs w:val="24"/>
+          <w:shd w:val="clear" w:color="auto" w:fill="FFFFFF"/>
+          <w:lang w:val="en-US"/>
+        </w:rPr>
+        <w:t>a</w:t>
+      </w:r>
+      <w:r>
+        <w:rPr>
+          <w:rFonts w:ascii="Times New Roman" w:hAnsi="Times New Roman" w:cs="Times New Roman"/>
+          <w:b/>
+          <w:color w:val="333333"/>
+          <w:sz w:val="24"/>
+          <w:szCs w:val="24"/>
+          <w:shd w:val="clear" w:color="auto" w:fill="FFFFFF"/>
+        </w:rPr>
+        <w:t xml:space="preserve"> == </w:t>
+      </w:r>
+      <w:r>
+        <w:rPr>
+          <w:rFonts w:ascii="Times New Roman" w:hAnsi="Times New Roman" w:cs="Times New Roman"/>
+          <w:b/>
+          <w:color w:val="333333"/>
+          <w:sz w:val="24"/>
+          <w:szCs w:val="24"/>
+          <w:shd w:val="clear" w:color="auto" w:fill="FFFFFF"/>
+          <w:lang w:val="en-US"/>
+        </w:rPr>
+        <w:t>f</w:t>
+      </w:r>
+      <w:r>
+        <w:rPr>
+          <w:rFonts w:ascii="Times New Roman" w:hAnsi="Times New Roman" w:cs="Times New Roman"/>
+          <w:b/>
+          <w:color w:val="333333"/>
+          <w:sz w:val="24"/>
+          <w:szCs w:val="24"/>
+          <w:shd w:val="clear" w:color="auto" w:fill="FFFFFF"/>
+        </w:rPr>
+        <w:t>(</w:t>
+      </w:r>
+      <w:r>
+        <w:rPr>
+          <w:rFonts w:ascii="Times New Roman" w:hAnsi="Times New Roman" w:cs="Times New Roman"/>
+          <w:b/>
+          <w:color w:val="333333"/>
+          <w:sz w:val="24"/>
+          <w:szCs w:val="24"/>
+          <w:shd w:val="clear" w:color="auto" w:fill="FFFFFF"/>
+          <w:lang w:val="en-US"/>
+        </w:rPr>
+        <w:t>x</w:t>
+      </w:r>
+      <w:r>
+        <w:rPr>
+          <w:rFonts w:ascii="Times New Roman" w:hAnsi="Times New Roman" w:cs="Times New Roman"/>
+          <w:b/>
+          <w:color w:val="333333"/>
+          <w:sz w:val="24"/>
+          <w:szCs w:val="24"/>
+          <w:shd w:val="clear" w:color="auto" w:fill="FFFFFF"/>
+        </w:rPr>
+        <w:t>) ))</w:t>
+      </w:r>
+    </w:p>
+    <w:p>
+      <w:pPr>
+        <w:spacing w:line="240" w:lineRule="auto"/>
+        <w:rPr>
+          <w:rFonts w:ascii="Times New Roman" w:hAnsi="Times New Roman" w:cs="Times New Roman"/>
+          <w:color w:val="333333"/>
+          <w:sz w:val="24"/>
+          <w:szCs w:val="24"/>
+          <w:shd w:val="clear" w:color="auto" w:fill="FFFFFF"/>
+        </w:rPr>
+      </w:pPr>
+      <w:r>
+        <w:rPr>
+          <w:rFonts w:ascii="Times New Roman" w:hAnsi="Times New Roman" w:cs="Times New Roman"/>
+          <w:color w:val="333333"/>
+          <w:sz w:val="24"/>
+          <w:szCs w:val="24"/>
+          <w:shd w:val="clear" w:color="auto" w:fill="FFFFFF"/>
+        </w:rPr>
+        <w:t>А. ошибки в написании оператора</w:t>
+      </w:r>
+    </w:p>
+    <w:p>
+      <w:pPr>
+        <w:spacing w:line="240" w:lineRule="auto"/>
+        <w:rPr>
+          <w:rFonts w:ascii="Times New Roman" w:hAnsi="Times New Roman" w:cs="Times New Roman"/>
+          <w:color w:val="333333"/>
+          <w:sz w:val="24"/>
+          <w:szCs w:val="24"/>
+          <w:shd w:val="clear" w:color="auto" w:fill="FFFFFF"/>
+        </w:rPr>
+      </w:pPr>
+      <w:r>
+        <w:rPr>
+          <w:rFonts w:ascii="Times New Roman" w:hAnsi="Times New Roman" w:cs="Times New Roman"/>
+          <w:color w:val="333333"/>
+          <w:sz w:val="24"/>
+          <w:szCs w:val="24"/>
+          <w:shd w:val="clear" w:color="auto" w:fill="FFFFFF"/>
+        </w:rPr>
+        <w:t>В. Отсутствие парной скобки</w:t>
+      </w:r>
+    </w:p>
+    <w:p>
+      <w:pPr>
+        <w:spacing w:line="240" w:lineRule="auto"/>
+        <w:rPr>
+          <w:rFonts w:ascii="Times New Roman" w:hAnsi="Times New Roman" w:cs="Times New Roman"/>
+          <w:color w:val="333333"/>
+          <w:sz w:val="24"/>
+          <w:szCs w:val="24"/>
+          <w:shd w:val="clear" w:color="auto" w:fill="FFFFFF"/>
+        </w:rPr>
+      </w:pPr>
+      <w:r>
+        <w:rPr>
+          <w:rFonts w:ascii="Times New Roman" w:hAnsi="Times New Roman" w:cs="Times New Roman"/>
+          <w:color w:val="333333"/>
+          <w:sz w:val="24"/>
+          <w:szCs w:val="24"/>
+          <w:shd w:val="clear" w:color="auto" w:fill="FFFFFF"/>
+        </w:rPr>
+        <w:t>С. ошибки в ключевом слове</w:t>
+      </w:r>
+    </w:p>
+    <w:p>
+      <w:pPr>
+        <w:spacing w:line="240" w:lineRule="auto"/>
+        <w:rPr>
+          <w:rFonts w:ascii="Times New Roman" w:hAnsi="Times New Roman" w:cs="Times New Roman"/>
+          <w:color w:val="00B050"/>
+          <w:sz w:val="24"/>
+          <w:szCs w:val="24"/>
+          <w:shd w:val="clear" w:color="auto" w:fill="FFFFFF"/>
+        </w:rPr>
+      </w:pPr>
+      <w:r>
+        <w:rPr>
+          <w:rFonts w:ascii="Times New Roman" w:hAnsi="Times New Roman" w:cs="Times New Roman"/>
+          <w:color w:val="00B050"/>
+          <w:sz w:val="24"/>
+          <w:szCs w:val="24"/>
+          <w:shd w:val="clear" w:color="auto" w:fill="FFFFFF"/>
+          <w:lang w:val="en-US"/>
+        </w:rPr>
+        <w:t>D</w:t>
+      </w:r>
+      <w:r>
+        <w:rPr>
+          <w:rFonts w:ascii="Times New Roman" w:hAnsi="Times New Roman" w:cs="Times New Roman"/>
+          <w:color w:val="00B050"/>
+          <w:sz w:val="24"/>
+          <w:szCs w:val="24"/>
+          <w:shd w:val="clear" w:color="auto" w:fill="FFFFFF"/>
+        </w:rPr>
+        <w:t>. не обнаружит ошибок</w:t>
+      </w:r>
+    </w:p>
+    <w:p>
+      <w:pPr>
+        <w:spacing w:line="240" w:lineRule="auto"/>
+        <w:rPr>
+          <w:rFonts w:ascii="Times New Roman" w:hAnsi="Times New Roman" w:cs="Times New Roman"/>
+          <w:color w:val="333333"/>
+          <w:sz w:val="24"/>
+          <w:szCs w:val="24"/>
+          <w:shd w:val="clear" w:color="auto" w:fill="FFFFFF"/>
+        </w:rPr>
+      </w:pPr>
+      <w:r>
+        <w:rPr>
+          <w:rFonts w:ascii="Times New Roman" w:hAnsi="Times New Roman" w:cs="Times New Roman"/>
+          <w:color w:val="333333"/>
+          <w:sz w:val="24"/>
+          <w:szCs w:val="24"/>
+          <w:shd w:val="clear" w:color="auto" w:fill="FFFFFF"/>
+          <w:lang w:val="en-US"/>
+        </w:rPr>
+        <w:t>E</w:t>
+      </w:r>
+      <w:r>
+        <w:rPr>
+          <w:rFonts w:ascii="Times New Roman" w:hAnsi="Times New Roman" w:cs="Times New Roman"/>
+          <w:color w:val="333333"/>
+          <w:sz w:val="24"/>
+          <w:szCs w:val="24"/>
+          <w:shd w:val="clear" w:color="auto" w:fill="FFFFFF"/>
+        </w:rPr>
+        <w:t xml:space="preserve">. </w:t>
+      </w:r>
+      <w:r>
+        <w:rPr>
+          <w:rFonts w:ascii="Times New Roman" w:hAnsi="Times New Roman" w:cs="Times New Roman"/>
+          <w:color w:val="333333"/>
+          <w:sz w:val="24"/>
+          <w:szCs w:val="24"/>
+          <w:shd w:val="clear" w:color="auto" w:fill="FFFFFF"/>
+        </w:rPr>
+        <w:t xml:space="preserve">ошибки в написании идентификатора </w:t>
+      </w:r>
+    </w:p>
+    <w:p>
+      <w:pPr>
+        <w:spacing w:line="240" w:lineRule="auto"/>
+        <w:rPr>
+          <w:rFonts w:ascii="Times New Roman" w:hAnsi="Times New Roman" w:cs="Times New Roman"/>
+          <w:b/>
+          <w:color w:val="333333"/>
+          <w:sz w:val="24"/>
+          <w:szCs w:val="24"/>
+          <w:shd w:val="clear" w:color="auto" w:fill="FFFFFF"/>
+        </w:rPr>
+      </w:pPr>
+      <w:r>
+        <w:rPr>
+          <w:rFonts w:ascii="Times New Roman" w:hAnsi="Times New Roman" w:cs="Times New Roman"/>
+          <w:b/>
+          <w:color w:val="333333"/>
+          <w:sz w:val="24"/>
+          <w:szCs w:val="24"/>
+          <w:shd w:val="clear" w:color="auto" w:fill="FFFFFF"/>
+        </w:rPr>
+        <w:t>12. КС-грамматика является леворекурсивной, если в ней существует вывод вида</w:t>
+      </w:r>
+    </w:p>
+    <w:p>
+      <w:pPr>
+        <w:spacing w:line="240" w:lineRule="auto"/>
+        <w:rPr>
+          <w:rFonts w:ascii="Times New Roman" w:hAnsi="Times New Roman" w:cs="Times New Roman"/>
+          <w:color w:val="00B050"/>
+          <w:sz w:val="24"/>
+          <w:szCs w:val="24"/>
+          <w:shd w:val="clear" w:color="auto" w:fill="FFFFFF"/>
+        </w:rPr>
+      </w:pPr>
+      <w:r>
+        <w:rPr>
+          <w:rFonts w:ascii="Times New Roman" w:hAnsi="Times New Roman" w:cs="Times New Roman"/>
+          <w:color w:val="00B050"/>
+          <w:sz w:val="24"/>
+          <w:szCs w:val="24"/>
+          <w:shd w:val="clear" w:color="auto" w:fill="FFFFFF"/>
+        </w:rPr>
+        <w:t xml:space="preserve">А. А =&gt; </w:t>
+      </w:r>
+      <w:proofErr w:type="spellStart"/>
+      <w:r>
+        <w:rPr>
+          <w:rFonts w:ascii="Times New Roman" w:hAnsi="Times New Roman" w:cs="Times New Roman"/>
+          <w:color w:val="00B050"/>
+          <w:sz w:val="24"/>
+          <w:szCs w:val="24"/>
+          <w:shd w:val="clear" w:color="auto" w:fill="FFFFFF"/>
+        </w:rPr>
+        <w:t>Аа</w:t>
+      </w:r>
+      <w:proofErr w:type="spellEnd"/>
+    </w:p>
+    <w:p>
+      <w:pPr>
+        <w:spacing w:line="240" w:lineRule="auto"/>
+        <w:rPr>
+          <w:rFonts w:ascii="Times New Roman" w:hAnsi="Times New Roman" w:cs="Times New Roman"/>
+          <w:color w:val="000000" w:themeColor="text1"/>
+          <w:sz w:val="24"/>
+          <w:szCs w:val="24"/>
+        </w:rPr>
+      </w:pPr>
+      <w:r>
+        <w:rPr>
+          <w:rFonts w:ascii="Times New Roman" w:hAnsi="Times New Roman" w:cs="Times New Roman"/>
+          <w:color w:val="000000" w:themeColor="text1"/>
+          <w:sz w:val="24"/>
+          <w:szCs w:val="24"/>
+          <w:shd w:val="clear" w:color="auto" w:fill="FFFFFF"/>
+        </w:rPr>
+        <w:t xml:space="preserve">В. А =&gt; </w:t>
+      </w:r>
+      <w:proofErr w:type="spellStart"/>
+      <w:r>
+        <w:rPr>
+          <w:rFonts w:ascii="Times New Roman" w:hAnsi="Times New Roman" w:cs="Times New Roman"/>
+          <w:color w:val="000000" w:themeColor="text1"/>
+          <w:sz w:val="24"/>
+          <w:szCs w:val="24"/>
+          <w:shd w:val="clear" w:color="auto" w:fill="FFFFFF"/>
+        </w:rPr>
+        <w:t>аА</w:t>
+      </w:r>
+      <w:proofErr w:type="spellEnd"/>
+    </w:p>
+    <w:p>
+      <w:pPr>
+        <w:spacing w:line="240" w:lineRule="auto"/>
+        <w:rPr>
+          <w:rFonts w:ascii="Times New Roman" w:hAnsi="Times New Roman" w:cs="Times New Roman"/>
+          <w:color w:val="000000" w:themeColor="text1"/>
+          <w:sz w:val="24"/>
+          <w:szCs w:val="24"/>
+        </w:rPr>
+      </w:pPr>
+      <w:r>
+        <w:rPr>
+          <w:rFonts w:ascii="Times New Roman" w:hAnsi="Times New Roman" w:cs="Times New Roman"/>
+          <w:color w:val="333333"/>
+          <w:sz w:val="24"/>
+          <w:szCs w:val="24"/>
+          <w:shd w:val="clear" w:color="auto" w:fill="FFFFFF"/>
+        </w:rPr>
+        <w:t>С. А =</w:t>
+      </w:r>
+      <w:r>
+        <w:rPr>
+          <w:rFonts w:ascii="Times New Roman" w:hAnsi="Times New Roman" w:cs="Times New Roman"/>
+          <w:color w:val="333333"/>
+          <w:sz w:val="24"/>
+          <w:szCs w:val="24"/>
+          <w:shd w:val="clear" w:color="auto" w:fill="FFFFFF"/>
+        </w:rPr>
+        <w:t>&gt;</w:t>
+      </w:r>
+      <w:r>
+        <w:rPr>
+          <w:rFonts w:ascii="Times New Roman" w:hAnsi="Times New Roman" w:cs="Times New Roman"/>
+          <w:color w:val="333333"/>
+          <w:sz w:val="24"/>
+          <w:szCs w:val="24"/>
+          <w:shd w:val="clear" w:color="auto" w:fill="FFFFFF"/>
+        </w:rPr>
+        <w:t xml:space="preserve"> А</w:t>
+      </w:r>
+    </w:p>
+    <w:p>
+      <w:pPr>
+        <w:spacing w:line="240" w:lineRule="auto"/>
+        <w:rPr>
+          <w:rFonts w:ascii="Times New Roman" w:hAnsi="Times New Roman" w:cs="Times New Roman"/>
+          <w:color w:val="000000" w:themeColor="text1"/>
+          <w:sz w:val="24"/>
+          <w:szCs w:val="24"/>
+        </w:rPr>
+      </w:pPr>
+      <w:r>
+        <w:rPr>
+          <w:rFonts w:ascii="Times New Roman" w:hAnsi="Times New Roman" w:cs="Times New Roman"/>
+          <w:color w:val="333333"/>
+          <w:sz w:val="24"/>
+          <w:szCs w:val="24"/>
+          <w:shd w:val="clear" w:color="auto" w:fill="FFFFFF"/>
+          <w:lang w:val="en-US"/>
+        </w:rPr>
+        <w:t>D</w:t>
+      </w:r>
+      <w:r>
+        <w:rPr>
+          <w:rFonts w:ascii="Times New Roman" w:hAnsi="Times New Roman" w:cs="Times New Roman"/>
+          <w:color w:val="333333"/>
+          <w:sz w:val="24"/>
+          <w:szCs w:val="24"/>
+          <w:shd w:val="clear" w:color="auto" w:fill="FFFFFF"/>
+        </w:rPr>
+        <w:t>. А =</w:t>
+      </w:r>
+      <w:r>
+        <w:rPr>
+          <w:rFonts w:ascii="Times New Roman" w:hAnsi="Times New Roman" w:cs="Times New Roman"/>
+          <w:color w:val="333333"/>
+          <w:sz w:val="24"/>
+          <w:szCs w:val="24"/>
+          <w:shd w:val="clear" w:color="auto" w:fill="FFFFFF"/>
+        </w:rPr>
+        <w:t>&gt;</w:t>
+      </w:r>
+      <w:r>
+        <w:rPr>
+          <w:rFonts w:ascii="Times New Roman" w:hAnsi="Times New Roman" w:cs="Times New Roman"/>
+          <w:color w:val="333333"/>
+          <w:sz w:val="24"/>
+          <w:szCs w:val="24"/>
+          <w:shd w:val="clear" w:color="auto" w:fill="FFFFFF"/>
+        </w:rPr>
         <w:t xml:space="preserve"> </w:t>
       </w:r>
-      <w:proofErr w:type="gramStart"/>
-      <w:r>
-        <w:rPr>
-          <w:rFonts w:ascii="Times New Roman" w:hAnsi="Times New Roman" w:cs="Times New Roman"/>
-          <w:b/>
-          <w:color w:val="333333"/>
-          <w:sz w:val="24"/>
-          <w:szCs w:val="24"/>
-          <w:shd w:val="clear" w:color="auto" w:fill="FFFFFF"/>
-        </w:rPr>
-        <w:t xml:space="preserve">( </w:t>
+      <w:proofErr w:type="spellStart"/>
+      <w:r>
+        <w:rPr>
+          <w:rFonts w:ascii="Times New Roman" w:hAnsi="Times New Roman" w:cs="Times New Roman"/>
+          <w:color w:val="333333"/>
+          <w:sz w:val="24"/>
+          <w:szCs w:val="24"/>
+          <w:shd w:val="clear" w:color="auto" w:fill="FFFFFF"/>
+        </w:rPr>
+        <w:t>АаА</w:t>
+      </w:r>
+      <w:proofErr w:type="spellEnd"/>
+    </w:p>
+    <w:p>
+      <w:pPr>
+        <w:spacing w:line="240" w:lineRule="auto"/>
+        <w:rPr>
+          <w:rFonts w:ascii="Times New Roman" w:hAnsi="Times New Roman" w:cs="Times New Roman"/>
+          <w:b/>
+          <w:color w:val="333333"/>
+          <w:sz w:val="24"/>
+          <w:szCs w:val="24"/>
+          <w:shd w:val="clear" w:color="auto" w:fill="FFFFFF"/>
+        </w:rPr>
+      </w:pPr>
+      <w:r>
+        <w:rPr>
+          <w:rFonts w:ascii="Times New Roman" w:hAnsi="Times New Roman" w:cs="Times New Roman"/>
+          <w:b/>
+          <w:color w:val="000000" w:themeColor="text1"/>
+          <w:sz w:val="24"/>
+          <w:szCs w:val="24"/>
+        </w:rPr>
+        <w:t xml:space="preserve">13. Сколько ошибок обнаружит синтаксический анализатор в строке </w:t>
+      </w:r>
+      <w:r>
+        <w:rPr>
+          <w:rFonts w:ascii="Times New Roman" w:hAnsi="Times New Roman" w:cs="Times New Roman"/>
+          <w:b/>
+          <w:color w:val="333333"/>
+          <w:sz w:val="24"/>
+          <w:szCs w:val="24"/>
+          <w:shd w:val="clear" w:color="auto" w:fill="FFFFFF"/>
+          <w:lang w:val="en-US"/>
+        </w:rPr>
+        <w:t>fi</w:t>
+      </w:r>
+      <w:r>
+        <w:rPr>
+          <w:rFonts w:ascii="Times New Roman" w:hAnsi="Times New Roman" w:cs="Times New Roman"/>
+          <w:b/>
+          <w:color w:val="333333"/>
+          <w:sz w:val="24"/>
+          <w:szCs w:val="24"/>
+          <w:shd w:val="clear" w:color="auto" w:fill="FFFFFF"/>
+        </w:rPr>
+        <w:t xml:space="preserve"> ( </w:t>
       </w:r>
       <w:r>
         <w:rPr>
@@ -1404,473 +1843,6 @@
         </w:rPr>
         <w:t>a</w:t>
       </w:r>
-      <w:proofErr w:type="gramEnd"/>
-      <w:r>
-        <w:rPr>
-          <w:rFonts w:ascii="Times New Roman" w:hAnsi="Times New Roman" w:cs="Times New Roman"/>
-          <w:b/>
-          <w:color w:val="333333"/>
-          <w:sz w:val="24"/>
-          <w:szCs w:val="24"/>
-          <w:shd w:val="clear" w:color="auto" w:fill="FFFFFF"/>
-        </w:rPr>
-        <w:t xml:space="preserve"> == </w:t>
-      </w:r>
-      <w:r>
-        <w:rPr>
-          <w:rFonts w:ascii="Times New Roman" w:hAnsi="Times New Roman" w:cs="Times New Roman"/>
-          <w:b/>
-          <w:color w:val="333333"/>
-          <w:sz w:val="24"/>
-          <w:szCs w:val="24"/>
-          <w:shd w:val="clear" w:color="auto" w:fill="FFFFFF"/>
-          <w:lang w:val="en-US"/>
-        </w:rPr>
-        <w:t>f</w:t>
-      </w:r>
-      <w:r>
-        <w:rPr>
-          <w:rFonts w:ascii="Times New Roman" w:hAnsi="Times New Roman" w:cs="Times New Roman"/>
-          <w:b/>
-          <w:color w:val="333333"/>
-          <w:sz w:val="24"/>
-          <w:szCs w:val="24"/>
-          <w:shd w:val="clear" w:color="auto" w:fill="FFFFFF"/>
-        </w:rPr>
-        <w:t>(</w:t>
-      </w:r>
-      <w:r>
-        <w:rPr>
-          <w:rFonts w:ascii="Times New Roman" w:hAnsi="Times New Roman" w:cs="Times New Roman"/>
-          <w:b/>
-          <w:color w:val="333333"/>
-          <w:sz w:val="24"/>
-          <w:szCs w:val="24"/>
-          <w:shd w:val="clear" w:color="auto" w:fill="FFFFFF"/>
-          <w:lang w:val="en-US"/>
-        </w:rPr>
-        <w:t>x</w:t>
-      </w:r>
-      <w:r>
-        <w:rPr>
-          <w:rFonts w:ascii="Times New Roman" w:hAnsi="Times New Roman" w:cs="Times New Roman"/>
-          <w:b/>
-          <w:color w:val="333333"/>
-          <w:sz w:val="24"/>
-          <w:szCs w:val="24"/>
-          <w:shd w:val="clear" w:color="auto" w:fill="FFFFFF"/>
-        </w:rPr>
-        <w:t>) ))</w:t>
-      </w:r>
-    </w:p>
-    <w:p>
-      <w:pPr>
-        <w:spacing w:line="240" w:lineRule="auto"/>
-        <w:rPr>
-          <w:rFonts w:ascii="Times New Roman" w:hAnsi="Times New Roman" w:cs="Times New Roman"/>
-          <w:color w:val="333333"/>
-          <w:sz w:val="24"/>
-          <w:szCs w:val="24"/>
-          <w:shd w:val="clear" w:color="auto" w:fill="FFFFFF"/>
-        </w:rPr>
-      </w:pPr>
-      <w:r>
-        <w:rPr>
-          <w:rFonts w:ascii="Times New Roman" w:hAnsi="Times New Roman" w:cs="Times New Roman"/>
-          <w:color w:val="333333"/>
-          <w:sz w:val="24"/>
-          <w:szCs w:val="24"/>
-          <w:shd w:val="clear" w:color="auto" w:fill="FFFFFF"/>
-        </w:rPr>
-        <w:t>А. ошибки в написании оператора</w:t>
-      </w:r>
-    </w:p>
-    <w:p>
-      <w:pPr>
-        <w:spacing w:line="240" w:lineRule="auto"/>
-        <w:rPr>
-          <w:rFonts w:ascii="Times New Roman" w:hAnsi="Times New Roman" w:cs="Times New Roman"/>
-          <w:color w:val="333333"/>
-          <w:sz w:val="24"/>
-          <w:szCs w:val="24"/>
-          <w:shd w:val="clear" w:color="auto" w:fill="FFFFFF"/>
-        </w:rPr>
-      </w:pPr>
-      <w:r>
-        <w:rPr>
-          <w:rFonts w:ascii="Times New Roman" w:hAnsi="Times New Roman" w:cs="Times New Roman"/>
-          <w:color w:val="333333"/>
-          <w:sz w:val="24"/>
-          <w:szCs w:val="24"/>
-          <w:shd w:val="clear" w:color="auto" w:fill="FFFFFF"/>
-        </w:rPr>
-        <w:t>В. Отсутствие парной скобки</w:t>
-      </w:r>
-    </w:p>
-    <w:p>
-      <w:pPr>
-        <w:spacing w:line="240" w:lineRule="auto"/>
-        <w:rPr>
-          <w:rFonts w:ascii="Times New Roman" w:hAnsi="Times New Roman" w:cs="Times New Roman"/>
-          <w:color w:val="333333"/>
-          <w:sz w:val="24"/>
-          <w:szCs w:val="24"/>
-          <w:shd w:val="clear" w:color="auto" w:fill="FFFFFF"/>
-        </w:rPr>
-      </w:pPr>
-      <w:r>
-        <w:rPr>
-          <w:rFonts w:ascii="Times New Roman" w:hAnsi="Times New Roman" w:cs="Times New Roman"/>
-          <w:color w:val="333333"/>
-          <w:sz w:val="24"/>
-          <w:szCs w:val="24"/>
-          <w:shd w:val="clear" w:color="auto" w:fill="FFFFFF"/>
-        </w:rPr>
-        <w:t>С. ошибки в ключевом слове</w:t>
-      </w:r>
-    </w:p>
-    <w:p>
-      <w:pPr>
-        <w:spacing w:line="240" w:lineRule="auto"/>
-        <w:rPr>
-          <w:rFonts w:ascii="Times New Roman" w:hAnsi="Times New Roman" w:cs="Times New Roman"/>
-          <w:color w:val="00B050"/>
-          <w:sz w:val="24"/>
-          <w:szCs w:val="24"/>
-          <w:shd w:val="clear" w:color="auto" w:fill="FFFFFF"/>
-        </w:rPr>
-      </w:pPr>
-      <w:r>
-        <w:rPr>
-          <w:rFonts w:ascii="Times New Roman" w:hAnsi="Times New Roman" w:cs="Times New Roman"/>
-          <w:color w:val="00B050"/>
-          <w:sz w:val="24"/>
-          <w:szCs w:val="24"/>
-          <w:shd w:val="clear" w:color="auto" w:fill="FFFFFF"/>
-          <w:lang w:val="en-US"/>
-        </w:rPr>
-        <w:t>D</w:t>
-      </w:r>
-      <w:r>
-        <w:rPr>
-          <w:rFonts w:ascii="Times New Roman" w:hAnsi="Times New Roman" w:cs="Times New Roman"/>
-          <w:color w:val="00B050"/>
-          <w:sz w:val="24"/>
-          <w:szCs w:val="24"/>
-          <w:shd w:val="clear" w:color="auto" w:fill="FFFFFF"/>
-        </w:rPr>
-        <w:t>. не обнаружит ошибок</w:t>
-      </w:r>
-    </w:p>
-    <w:p>
-      <w:pPr>
-        <w:spacing w:line="240" w:lineRule="auto"/>
-        <w:rPr>
-          <w:rFonts w:ascii="Times New Roman" w:hAnsi="Times New Roman" w:cs="Times New Roman"/>
-          <w:color w:val="333333"/>
-          <w:sz w:val="24"/>
-          <w:szCs w:val="24"/>
-          <w:shd w:val="clear" w:color="auto" w:fill="FFFFFF"/>
-        </w:rPr>
-      </w:pPr>
-      <w:r>
-        <w:rPr>
-          <w:rFonts w:ascii="Times New Roman" w:hAnsi="Times New Roman" w:cs="Times New Roman"/>
-          <w:color w:val="333333"/>
-          <w:sz w:val="24"/>
-          <w:szCs w:val="24"/>
-          <w:shd w:val="clear" w:color="auto" w:fill="FFFFFF"/>
-          <w:lang w:val="en-US"/>
-        </w:rPr>
-        <w:t>E</w:t>
-      </w:r>
-      <w:r>
-        <w:rPr>
-          <w:rFonts w:ascii="Times New Roman" w:hAnsi="Times New Roman" w:cs="Times New Roman"/>
-          <w:color w:val="333333"/>
-          <w:sz w:val="24"/>
-          <w:szCs w:val="24"/>
-          <w:shd w:val="clear" w:color="auto" w:fill="FFFFFF"/>
-        </w:rPr>
-        <w:t xml:space="preserve">. </w:t>
-      </w:r>
-      <w:r>
-        <w:rPr>
-          <w:rFonts w:ascii="Times New Roman" w:hAnsi="Times New Roman" w:cs="Times New Roman"/>
-          <w:color w:val="333333"/>
-          <w:sz w:val="24"/>
-          <w:szCs w:val="24"/>
-          <w:shd w:val="clear" w:color="auto" w:fill="FFFFFF"/>
-        </w:rPr>
-        <w:t xml:space="preserve">ошибки в написании идентификатора </w:t>
-      </w:r>
-    </w:p>
-    <w:p>
-      <w:pPr>
-        <w:spacing w:line="240" w:lineRule="auto"/>
-        <w:rPr>
-          <w:rFonts w:ascii="Times New Roman" w:hAnsi="Times New Roman" w:cs="Times New Roman"/>
-          <w:b/>
-          <w:color w:val="333333"/>
-          <w:sz w:val="24"/>
-          <w:szCs w:val="24"/>
-          <w:shd w:val="clear" w:color="auto" w:fill="FFFFFF"/>
-        </w:rPr>
-      </w:pPr>
-      <w:r>
-        <w:rPr>
-          <w:rFonts w:ascii="Times New Roman" w:hAnsi="Times New Roman" w:cs="Times New Roman"/>
-          <w:b/>
-          <w:color w:val="333333"/>
-          <w:sz w:val="24"/>
-          <w:szCs w:val="24"/>
-          <w:shd w:val="clear" w:color="auto" w:fill="FFFFFF"/>
-        </w:rPr>
-        <w:t>12. КС-грамматика является леворекурсивной, если в ней существует вывод вида</w:t>
-      </w:r>
-    </w:p>
-    <w:p>
-      <w:pPr>
-        <w:spacing w:line="240" w:lineRule="auto"/>
-        <w:rPr>
-          <w:rFonts w:ascii="Times New Roman" w:hAnsi="Times New Roman" w:cs="Times New Roman"/>
-          <w:color w:val="00B050"/>
-          <w:sz w:val="24"/>
-          <w:szCs w:val="24"/>
-          <w:shd w:val="clear" w:color="auto" w:fill="FFFFFF"/>
-        </w:rPr>
-      </w:pPr>
-      <w:r>
-        <w:rPr>
-          <w:rFonts w:ascii="Times New Roman" w:hAnsi="Times New Roman" w:cs="Times New Roman"/>
-          <w:color w:val="00B050"/>
-          <w:sz w:val="24"/>
-          <w:szCs w:val="24"/>
-          <w:shd w:val="clear" w:color="auto" w:fill="FFFFFF"/>
-        </w:rPr>
-        <w:t xml:space="preserve">А. А =&gt; </w:t>
-      </w:r>
-      <w:proofErr w:type="spellStart"/>
-      <w:r>
-        <w:rPr>
-          <w:rFonts w:ascii="Times New Roman" w:hAnsi="Times New Roman" w:cs="Times New Roman"/>
-          <w:color w:val="00B050"/>
-          <w:sz w:val="24"/>
-          <w:szCs w:val="24"/>
-          <w:shd w:val="clear" w:color="auto" w:fill="FFFFFF"/>
-        </w:rPr>
-        <w:t>Аа</w:t>
-      </w:r>
-      <w:proofErr w:type="spellEnd"/>
-    </w:p>
-    <w:p>
-      <w:pPr>
-        <w:spacing w:line="240" w:lineRule="auto"/>
-        <w:rPr>
-          <w:rFonts w:ascii="Times New Roman" w:hAnsi="Times New Roman" w:cs="Times New Roman"/>
-          <w:color w:val="000000" w:themeColor="text1"/>
-          <w:sz w:val="24"/>
-          <w:szCs w:val="24"/>
-        </w:rPr>
-      </w:pPr>
-      <w:r>
-        <w:rPr>
-          <w:rFonts w:ascii="Times New Roman" w:hAnsi="Times New Roman" w:cs="Times New Roman"/>
-          <w:color w:val="000000" w:themeColor="text1"/>
-          <w:sz w:val="24"/>
-          <w:szCs w:val="24"/>
-          <w:shd w:val="clear" w:color="auto" w:fill="FFFFFF"/>
-        </w:rPr>
-        <w:t xml:space="preserve">В. А =&gt; </w:t>
-      </w:r>
-      <w:proofErr w:type="spellStart"/>
-      <w:r>
-        <w:rPr>
-          <w:rFonts w:ascii="Times New Roman" w:hAnsi="Times New Roman" w:cs="Times New Roman"/>
-          <w:color w:val="000000" w:themeColor="text1"/>
-          <w:sz w:val="24"/>
-          <w:szCs w:val="24"/>
-          <w:shd w:val="clear" w:color="auto" w:fill="FFFFFF"/>
-        </w:rPr>
-        <w:t>аА</w:t>
-      </w:r>
-      <w:proofErr w:type="spellEnd"/>
-    </w:p>
-    <w:p>
-      <w:pPr>
-        <w:spacing w:line="240" w:lineRule="auto"/>
-        <w:rPr>
-          <w:rFonts w:ascii="Times New Roman" w:hAnsi="Times New Roman" w:cs="Times New Roman"/>
-          <w:color w:val="000000" w:themeColor="text1"/>
-          <w:sz w:val="24"/>
-          <w:szCs w:val="24"/>
-        </w:rPr>
-      </w:pPr>
-      <w:r>
-        <w:rPr>
-          <w:rFonts w:ascii="Times New Roman" w:hAnsi="Times New Roman" w:cs="Times New Roman"/>
-          <w:color w:val="333333"/>
-          <w:sz w:val="24"/>
-          <w:szCs w:val="24"/>
-          <w:shd w:val="clear" w:color="auto" w:fill="FFFFFF"/>
-        </w:rPr>
-        <w:t>С. А =</w:t>
-      </w:r>
-      <w:r>
-        <w:rPr>
-          <w:rFonts w:ascii="Times New Roman" w:hAnsi="Times New Roman" w:cs="Times New Roman"/>
-          <w:color w:val="333333"/>
-          <w:sz w:val="24"/>
-          <w:szCs w:val="24"/>
-          <w:shd w:val="clear" w:color="auto" w:fill="FFFFFF"/>
-        </w:rPr>
-        <w:t>&gt;</w:t>
-      </w:r>
-      <w:r>
-        <w:rPr>
-          <w:rFonts w:ascii="Times New Roman" w:hAnsi="Times New Roman" w:cs="Times New Roman"/>
-          <w:color w:val="333333"/>
-          <w:sz w:val="24"/>
-          <w:szCs w:val="24"/>
-          <w:shd w:val="clear" w:color="auto" w:fill="FFFFFF"/>
-        </w:rPr>
-        <w:t xml:space="preserve"> А</w:t>
-      </w:r>
-    </w:p>
-    <w:p>
-      <w:pPr>
-        <w:spacing w:line="240" w:lineRule="auto"/>
-        <w:rPr>
-          <w:rFonts w:ascii="Times New Roman" w:hAnsi="Times New Roman" w:cs="Times New Roman"/>
-          <w:color w:val="000000" w:themeColor="text1"/>
-          <w:sz w:val="24"/>
-          <w:szCs w:val="24"/>
-        </w:rPr>
-      </w:pPr>
-      <w:r>
-        <w:rPr>
-          <w:rFonts w:ascii="Times New Roman" w:hAnsi="Times New Roman" w:cs="Times New Roman"/>
-          <w:color w:val="333333"/>
-          <w:sz w:val="24"/>
-          <w:szCs w:val="24"/>
-          <w:shd w:val="clear" w:color="auto" w:fill="FFFFFF"/>
-          <w:lang w:val="en-US"/>
-        </w:rPr>
-        <w:t>D</w:t>
-      </w:r>
-      <w:r>
-        <w:rPr>
-          <w:rFonts w:ascii="Times New Roman" w:hAnsi="Times New Roman" w:cs="Times New Roman"/>
-          <w:color w:val="333333"/>
-          <w:sz w:val="24"/>
-          <w:szCs w:val="24"/>
-          <w:shd w:val="clear" w:color="auto" w:fill="FFFFFF"/>
-        </w:rPr>
-        <w:t>. А =</w:t>
-      </w:r>
-      <w:r>
-        <w:rPr>
-          <w:rFonts w:ascii="Times New Roman" w:hAnsi="Times New Roman" w:cs="Times New Roman"/>
-          <w:color w:val="333333"/>
-          <w:sz w:val="24"/>
-          <w:szCs w:val="24"/>
-          <w:shd w:val="clear" w:color="auto" w:fill="FFFFFF"/>
-        </w:rPr>
-        <w:t>&gt;</w:t>
-      </w:r>
-      <w:r>
-        <w:rPr>
-          <w:rFonts w:ascii="Times New Roman" w:hAnsi="Times New Roman" w:cs="Times New Roman"/>
-          <w:color w:val="333333"/>
-          <w:sz w:val="24"/>
-          <w:szCs w:val="24"/>
-          <w:shd w:val="clear" w:color="auto" w:fill="FFFFFF"/>
-        </w:rPr>
-        <w:t xml:space="preserve"> </w:t>
-      </w:r>
-      <w:proofErr w:type="spellStart"/>
-      <w:r>
-        <w:rPr>
-          <w:rFonts w:ascii="Times New Roman" w:hAnsi="Times New Roman" w:cs="Times New Roman"/>
-          <w:color w:val="333333"/>
-          <w:sz w:val="24"/>
-          <w:szCs w:val="24"/>
-          <w:shd w:val="clear" w:color="auto" w:fill="FFFFFF"/>
-        </w:rPr>
-        <w:t>АаА</w:t>
-      </w:r>
-      <w:proofErr w:type="spellEnd"/>
-    </w:p>
-    <w:p>
-      <w:pPr>
-        <w:spacing w:line="240" w:lineRule="auto"/>
-        <w:rPr>
-          <w:rFonts w:ascii="Times New Roman" w:hAnsi="Times New Roman" w:cs="Times New Roman"/>
-          <w:b/>
-          <w:color w:val="333333"/>
-          <w:sz w:val="24"/>
-          <w:szCs w:val="24"/>
-          <w:shd w:val="clear" w:color="auto" w:fill="FFFFFF"/>
-        </w:rPr>
-      </w:pPr>
-      <w:r>
-        <w:rPr>
-          <w:rFonts w:ascii="Times New Roman" w:hAnsi="Times New Roman" w:cs="Times New Roman"/>
-          <w:b/>
-          <w:color w:val="000000" w:themeColor="text1"/>
-          <w:sz w:val="24"/>
-          <w:szCs w:val="24"/>
-        </w:rPr>
-        <w:t xml:space="preserve">13. Сколько ошибок обнаружит синтаксический анализатор в строке </w:t>
-      </w:r>
-      <w:r>
-        <w:rPr>
-          <w:rFonts w:ascii="Times New Roman" w:hAnsi="Times New Roman" w:cs="Times New Roman"/>
-          <w:b/>
-          <w:color w:val="333333"/>
-          <w:sz w:val="24"/>
-          <w:szCs w:val="24"/>
-          <w:shd w:val="clear" w:color="auto" w:fill="FFFFFF"/>
-          <w:lang w:val="en-US"/>
-        </w:rPr>
-        <w:t>fi</w:t>
-      </w:r>
-      <w:r>
-        <w:rPr>
-          <w:rFonts w:ascii="Times New Roman" w:hAnsi="Times New Roman" w:cs="Times New Roman"/>
-          <w:b/>
-          <w:color w:val="333333"/>
-          <w:sz w:val="24"/>
-          <w:szCs w:val="24"/>
-          <w:shd w:val="clear" w:color="auto" w:fill="FFFFFF"/>
-        </w:rPr>
-        <w:t xml:space="preserve"> </w:t>
-      </w:r>
-      <w:proofErr w:type="gramStart"/>
-      <w:r>
-        <w:rPr>
-          <w:rFonts w:ascii="Times New Roman" w:hAnsi="Times New Roman" w:cs="Times New Roman"/>
-          <w:b/>
-          <w:color w:val="333333"/>
-          <w:sz w:val="24"/>
-          <w:szCs w:val="24"/>
-          <w:shd w:val="clear" w:color="auto" w:fill="FFFFFF"/>
-        </w:rPr>
-        <w:t xml:space="preserve">( </w:t>
-      </w:r>
-      <w:r>
-        <w:rPr>
-          <w:rFonts w:ascii="Times New Roman" w:hAnsi="Times New Roman" w:cs="Times New Roman"/>
-          <w:b/>
-          <w:color w:val="333333"/>
-          <w:sz w:val="24"/>
-          <w:szCs w:val="24"/>
-          <w:shd w:val="clear" w:color="auto" w:fill="FFFFFF"/>
-          <w:lang w:val="en-US"/>
-        </w:rPr>
-        <w:t>a</w:t>
-      </w:r>
-      <w:proofErr w:type="gramEnd"/>
       <w:r>
         <w:rPr>
           <w:rFonts w:ascii="Times New Roman" w:hAnsi="Times New Roman" w:cs="Times New Roman"/>
@@ -2200,31 +2172,7 @@
           <w:shd w:val="clear" w:color="auto" w:fill="FFFFFF"/>
           <w:lang w:val="en-US"/>
         </w:rPr>
-        <w:t xml:space="preserve">P: </w:t>
-      </w:r>
-      <w:proofErr w:type="gramStart"/>
-      <w:r>
-        <w:rPr>
-          <w:rFonts w:ascii="Times New Roman" w:hAnsi="Times New Roman" w:cs="Times New Roman"/>
-          <w:color w:val="333333"/>
-          <w:sz w:val="24"/>
-          <w:szCs w:val="24"/>
-          <w:shd w:val="clear" w:color="auto" w:fill="FFFFFF"/>
-          <w:lang w:val="en-US"/>
-        </w:rPr>
-        <w:t>{ 1</w:t>
-      </w:r>
-      <w:proofErr w:type="gramEnd"/>
-      <w:r>
-        <w:rPr>
-          <w:rFonts w:ascii="Times New Roman" w:hAnsi="Times New Roman" w:cs="Times New Roman"/>
-          <w:color w:val="333333"/>
-          <w:sz w:val="24"/>
-          <w:szCs w:val="24"/>
-          <w:shd w:val="clear" w:color="auto" w:fill="FFFFFF"/>
-          <w:lang w:val="en-US"/>
-        </w:rPr>
-        <w:t>)A-&gt;b 4) b-&gt;</w:t>
+        <w:t>P: { 1)A-&gt;b 4) b-&gt;</w:t>
       </w:r>
       <w:proofErr w:type="spellStart"/>
       <w:r>
@@ -2598,22 +2546,218 @@
           <w:szCs w:val="24"/>
           <w:shd w:val="clear" w:color="auto" w:fill="FFFFFF"/>
         </w:rPr>
+        <w:t xml:space="preserve"> ( </w:t>
+      </w:r>
+      <w:r>
+        <w:rPr>
+          <w:rFonts w:ascii="Times New Roman" w:hAnsi="Times New Roman" w:cs="Times New Roman"/>
+          <w:color w:val="333333"/>
+          <w:sz w:val="24"/>
+          <w:szCs w:val="24"/>
+          <w:shd w:val="clear" w:color="auto" w:fill="FFFFFF"/>
+          <w:lang w:val="en-US"/>
+        </w:rPr>
+        <w:t>a</w:t>
+      </w:r>
+      <w:r>
+        <w:rPr>
+          <w:rFonts w:ascii="Times New Roman" w:hAnsi="Times New Roman" w:cs="Times New Roman"/>
+          <w:color w:val="333333"/>
+          <w:sz w:val="24"/>
+          <w:szCs w:val="24"/>
+          <w:shd w:val="clear" w:color="auto" w:fill="FFFFFF"/>
+        </w:rPr>
+        <w:t xml:space="preserve"> == </w:t>
+      </w:r>
+      <w:r>
+        <w:rPr>
+          <w:rFonts w:ascii="Times New Roman" w:hAnsi="Times New Roman" w:cs="Times New Roman"/>
+          <w:color w:val="333333"/>
+          <w:sz w:val="24"/>
+          <w:szCs w:val="24"/>
+          <w:shd w:val="clear" w:color="auto" w:fill="FFFFFF"/>
+          <w:lang w:val="en-US"/>
+        </w:rPr>
+        <w:t>f</w:t>
+      </w:r>
+      <w:r>
+        <w:rPr>
+          <w:rFonts w:ascii="Times New Roman" w:hAnsi="Times New Roman" w:cs="Times New Roman"/>
+          <w:color w:val="333333"/>
+          <w:sz w:val="24"/>
+          <w:szCs w:val="24"/>
+          <w:shd w:val="clear" w:color="auto" w:fill="FFFFFF"/>
+        </w:rPr>
+        <w:t>(</w:t>
+      </w:r>
+      <w:r>
+        <w:rPr>
+          <w:rFonts w:ascii="Times New Roman" w:hAnsi="Times New Roman" w:cs="Times New Roman"/>
+          <w:color w:val="333333"/>
+          <w:sz w:val="24"/>
+          <w:szCs w:val="24"/>
+          <w:shd w:val="clear" w:color="auto" w:fill="FFFFFF"/>
+          <w:lang w:val="en-US"/>
+        </w:rPr>
+        <w:t>x</w:t>
+      </w:r>
+      <w:r>
+        <w:rPr>
+          <w:rFonts w:ascii="Times New Roman" w:hAnsi="Times New Roman" w:cs="Times New Roman"/>
+          <w:color w:val="333333"/>
+          <w:sz w:val="24"/>
+          <w:szCs w:val="24"/>
+          <w:shd w:val="clear" w:color="auto" w:fill="FFFFFF"/>
+        </w:rPr>
+        <w:t>)</w:t>
+      </w:r>
+      <w:r>
+        <w:rPr>
+          <w:rFonts w:ascii="Times New Roman" w:hAnsi="Times New Roman" w:cs="Times New Roman"/>
+          <w:color w:val="333333"/>
+          <w:sz w:val="24"/>
+          <w:szCs w:val="24"/>
+          <w:shd w:val="clear" w:color="auto" w:fill="FFFFFF"/>
+        </w:rPr>
         <w:t xml:space="preserve"> </w:t>
       </w:r>
-      <w:proofErr w:type="gramStart"/>
-      <w:r>
-        <w:rPr>
-          <w:rFonts w:ascii="Times New Roman" w:hAnsi="Times New Roman" w:cs="Times New Roman"/>
-          <w:color w:val="333333"/>
-          <w:sz w:val="24"/>
-          <w:szCs w:val="24"/>
-          <w:shd w:val="clear" w:color="auto" w:fill="FFFFFF"/>
-        </w:rPr>
-        <w:t xml:space="preserve">( </w:t>
-      </w:r>
-      <w:r>
-        <w:rPr>
-          <w:rFonts w:ascii="Times New Roman" w:hAnsi="Times New Roman" w:cs="Times New Roman"/>
+      <w:r>
+        <w:rPr>
+          <w:rFonts w:ascii="Times New Roman" w:hAnsi="Times New Roman" w:cs="Times New Roman"/>
+          <w:color w:val="333333"/>
+          <w:sz w:val="24"/>
+          <w:szCs w:val="24"/>
+          <w:shd w:val="clear" w:color="auto" w:fill="FFFFFF"/>
+        </w:rPr>
+        <w:t>))</w:t>
+      </w:r>
+    </w:p>
+    <w:p>
+      <w:pPr>
+        <w:spacing w:line="240" w:lineRule="auto"/>
+        <w:rPr>
+          <w:rFonts w:ascii="Times New Roman" w:hAnsi="Times New Roman" w:cs="Times New Roman"/>
+          <w:color w:val="00B050"/>
+          <w:sz w:val="24"/>
+          <w:szCs w:val="24"/>
+          <w:shd w:val="clear" w:color="auto" w:fill="FFFFFF"/>
+        </w:rPr>
+      </w:pPr>
+      <w:r>
+        <w:rPr>
+          <w:rFonts w:ascii="Times New Roman" w:hAnsi="Times New Roman" w:cs="Times New Roman"/>
+          <w:color w:val="00B050"/>
+          <w:sz w:val="24"/>
+          <w:szCs w:val="24"/>
+          <w:shd w:val="clear" w:color="auto" w:fill="FFFFFF"/>
+        </w:rPr>
+        <w:t>А. синтаксический анализ</w:t>
+      </w:r>
+    </w:p>
+    <w:p>
+      <w:pPr>
+        <w:spacing w:line="240" w:lineRule="auto"/>
+        <w:rPr>
+          <w:rFonts w:ascii="Times New Roman" w:hAnsi="Times New Roman" w:cs="Times New Roman"/>
+          <w:color w:val="333333"/>
+          <w:sz w:val="24"/>
+          <w:szCs w:val="24"/>
+          <w:shd w:val="clear" w:color="auto" w:fill="FFFFFF"/>
+        </w:rPr>
+      </w:pPr>
+      <w:r>
+        <w:rPr>
+          <w:rFonts w:ascii="Times New Roman" w:hAnsi="Times New Roman" w:cs="Times New Roman"/>
+          <w:color w:val="333333"/>
+          <w:sz w:val="24"/>
+          <w:szCs w:val="24"/>
+          <w:shd w:val="clear" w:color="auto" w:fill="FFFFFF"/>
+        </w:rPr>
+        <w:t>В. лексический анализ</w:t>
+      </w:r>
+    </w:p>
+    <w:p>
+      <w:pPr>
+        <w:spacing w:line="240" w:lineRule="auto"/>
+        <w:rPr>
+          <w:rFonts w:ascii="Times New Roman" w:hAnsi="Times New Roman" w:cs="Times New Roman"/>
+          <w:color w:val="000000" w:themeColor="text1"/>
+          <w:sz w:val="24"/>
+          <w:szCs w:val="24"/>
+          <w:shd w:val="clear" w:color="auto" w:fill="FFFFFF"/>
+        </w:rPr>
+      </w:pPr>
+      <w:r>
+        <w:rPr>
+          <w:rFonts w:ascii="Times New Roman" w:hAnsi="Times New Roman" w:cs="Times New Roman"/>
+          <w:color w:val="000000" w:themeColor="text1"/>
+          <w:sz w:val="24"/>
+          <w:szCs w:val="24"/>
+          <w:shd w:val="clear" w:color="auto" w:fill="FFFFFF"/>
+        </w:rPr>
+        <w:t>С. семантический анализ</w:t>
+      </w:r>
+    </w:p>
+    <w:p>
+      <w:pPr>
+        <w:spacing w:line="240" w:lineRule="auto"/>
+        <w:rPr>
+          <w:rFonts w:ascii="Times New Roman" w:hAnsi="Times New Roman" w:cs="Times New Roman"/>
+          <w:b/>
+          <w:color w:val="333333"/>
+          <w:sz w:val="24"/>
+          <w:szCs w:val="24"/>
+          <w:shd w:val="clear" w:color="auto" w:fill="FFFFFF"/>
+        </w:rPr>
+      </w:pPr>
+      <w:r>
+        <w:rPr>
+          <w:rFonts w:ascii="Times New Roman" w:hAnsi="Times New Roman" w:cs="Times New Roman"/>
+          <w:b/>
+          <w:color w:val="333333"/>
+          <w:sz w:val="24"/>
+          <w:szCs w:val="24"/>
+          <w:shd w:val="clear" w:color="auto" w:fill="FFFFFF"/>
+        </w:rPr>
+        <w:t xml:space="preserve">18. </w:t>
+      </w:r>
+      <w:r>
+        <w:rPr>
+          <w:rFonts w:ascii="Times New Roman" w:hAnsi="Times New Roman" w:cs="Times New Roman"/>
+          <w:b/>
+          <w:color w:val="000000" w:themeColor="text1"/>
+          <w:sz w:val="24"/>
+          <w:szCs w:val="24"/>
+        </w:rPr>
+        <w:t xml:space="preserve">Сколько ошибок обнаружит лексический анализатор в строке </w:t>
+      </w:r>
+      <w:r>
+        <w:rPr>
+          <w:rFonts w:ascii="Times New Roman" w:hAnsi="Times New Roman" w:cs="Times New Roman"/>
+          <w:b/>
+          <w:color w:val="333333"/>
+          <w:sz w:val="24"/>
+          <w:szCs w:val="24"/>
+          <w:shd w:val="clear" w:color="auto" w:fill="FFFFFF"/>
+          <w:lang w:val="en-US"/>
+        </w:rPr>
+        <w:t>fi</w:t>
+      </w:r>
+      <w:r>
+        <w:rPr>
+          <w:rFonts w:ascii="Times New Roman" w:hAnsi="Times New Roman" w:cs="Times New Roman"/>
+          <w:b/>
+          <w:color w:val="333333"/>
+          <w:sz w:val="24"/>
+          <w:szCs w:val="24"/>
+          <w:shd w:val="clear" w:color="auto" w:fill="FFFFFF"/>
+        </w:rPr>
+        <w:t xml:space="preserve"> ( </w:t>
+      </w:r>
+      <w:r>
+        <w:rPr>
+          <w:rFonts w:ascii="Times New Roman" w:hAnsi="Times New Roman" w:cs="Times New Roman"/>
+          <w:b/>
           <w:color w:val="333333"/>
           <w:sz w:val="24"/>
           <w:szCs w:val="24"/>
@@ -2622,20 +2766,21 @@
         </w:rPr>
         <w:t>a</w:t>
       </w:r>
-      <w:proofErr w:type="gramEnd"/>
-      <w:r>
-        <w:rPr>
-          <w:rFonts w:ascii="Times New Roman" w:hAnsi="Times New Roman" w:cs="Times New Roman"/>
-          <w:color w:val="333333"/>
-          <w:sz w:val="24"/>
-          <w:szCs w:val="24"/>
-          <w:shd w:val="clear" w:color="auto" w:fill="FFFFFF"/>
-        </w:rPr>
-        <w:t xml:space="preserve"> == </w:t>
-      </w:r>
-      <w:r>
-        <w:rPr>
-          <w:rFonts w:ascii="Times New Roman" w:hAnsi="Times New Roman" w:cs="Times New Roman"/>
+      <w:r>
+        <w:rPr>
+          <w:rFonts w:ascii="Times New Roman" w:hAnsi="Times New Roman" w:cs="Times New Roman"/>
+          <w:b/>
+          <w:color w:val="333333"/>
+          <w:sz w:val="24"/>
+          <w:szCs w:val="24"/>
+          <w:shd w:val="clear" w:color="auto" w:fill="FFFFFF"/>
+        </w:rPr>
+        <w:t xml:space="preserve"> = </w:t>
+      </w:r>
+      <w:r>
+        <w:rPr>
+          <w:rFonts w:ascii="Times New Roman" w:hAnsi="Times New Roman" w:cs="Times New Roman"/>
+          <w:b/>
           <w:color w:val="333333"/>
           <w:sz w:val="24"/>
           <w:szCs w:val="24"/>
@@ -2647,16 +2792,18 @@
       <w:r>
         <w:rPr>
           <w:rFonts w:ascii="Times New Roman" w:hAnsi="Times New Roman" w:cs="Times New Roman"/>
-          <w:color w:val="333333"/>
-          <w:sz w:val="24"/>
-          <w:szCs w:val="24"/>
-          <w:shd w:val="clear" w:color="auto" w:fill="FFFFFF"/>
-        </w:rPr>
-        <w:t>(</w:t>
-      </w:r>
-      <w:r>
-        <w:rPr>
-          <w:rFonts w:ascii="Times New Roman" w:hAnsi="Times New Roman" w:cs="Times New Roman"/>
+          <w:b/>
+          <w:color w:val="333333"/>
+          <w:sz w:val="24"/>
+          <w:szCs w:val="24"/>
+          <w:shd w:val="clear" w:color="auto" w:fill="FFFFFF"/>
+        </w:rPr>
+        <w:t>(1</w:t>
+      </w:r>
+      <w:r>
+        <w:rPr>
+          <w:rFonts w:ascii="Times New Roman" w:hAnsi="Times New Roman" w:cs="Times New Roman"/>
+          <w:b/>
           <w:color w:val="333333"/>
           <w:sz w:val="24"/>
           <w:szCs w:val="24"/>
@@ -2668,230 +2815,6 @@
       <w:r>
         <w:rPr>
           <w:rFonts w:ascii="Times New Roman" w:hAnsi="Times New Roman" w:cs="Times New Roman"/>
-          <w:color w:val="333333"/>
-          <w:sz w:val="24"/>
-          <w:szCs w:val="24"/>
-          <w:shd w:val="clear" w:color="auto" w:fill="FFFFFF"/>
-        </w:rPr>
-        <w:t>)</w:t>
-      </w:r>
-      <w:r>
-        <w:rPr>
-          <w:rFonts w:ascii="Times New Roman" w:hAnsi="Times New Roman" w:cs="Times New Roman"/>
-          <w:color w:val="333333"/>
-          <w:sz w:val="24"/>
-          <w:szCs w:val="24"/>
-          <w:shd w:val="clear" w:color="auto" w:fill="FFFFFF"/>
-        </w:rPr>
-        <w:t xml:space="preserve"> </w:t>
-      </w:r>
-      <w:r>
-        <w:rPr>
-          <w:rFonts w:ascii="Times New Roman" w:hAnsi="Times New Roman" w:cs="Times New Roman"/>
-          <w:color w:val="333333"/>
-          <w:sz w:val="24"/>
-          <w:szCs w:val="24"/>
-          <w:shd w:val="clear" w:color="auto" w:fill="FFFFFF"/>
-        </w:rPr>
-        <w:t>))</w:t>
-      </w:r>
-    </w:p>
-    <w:p>
-      <w:pPr>
-        <w:spacing w:line="240" w:lineRule="auto"/>
-        <w:rPr>
-          <w:rFonts w:ascii="Times New Roman" w:hAnsi="Times New Roman" w:cs="Times New Roman"/>
-          <w:color w:val="333333"/>
-          <w:sz w:val="24"/>
-          <w:szCs w:val="24"/>
-          <w:shd w:val="clear" w:color="auto" w:fill="FFFFFF"/>
-        </w:rPr>
-      </w:pPr>
-      <w:r>
-        <w:rPr>
-          <w:rFonts w:ascii="Times New Roman" w:hAnsi="Times New Roman" w:cs="Times New Roman"/>
-          <w:color w:val="333333"/>
-          <w:sz w:val="24"/>
-          <w:szCs w:val="24"/>
-          <w:shd w:val="clear" w:color="auto" w:fill="FFFFFF"/>
-        </w:rPr>
-        <w:t>А. синтаксический анализ</w:t>
-      </w:r>
-    </w:p>
-    <w:p>
-      <w:pPr>
-        <w:spacing w:line="240" w:lineRule="auto"/>
-        <w:rPr>
-          <w:rFonts w:ascii="Times New Roman" w:hAnsi="Times New Roman" w:cs="Times New Roman"/>
-          <w:color w:val="333333"/>
-          <w:sz w:val="24"/>
-          <w:szCs w:val="24"/>
-          <w:shd w:val="clear" w:color="auto" w:fill="FFFFFF"/>
-        </w:rPr>
-      </w:pPr>
-      <w:r>
-        <w:rPr>
-          <w:rFonts w:ascii="Times New Roman" w:hAnsi="Times New Roman" w:cs="Times New Roman"/>
-          <w:color w:val="333333"/>
-          <w:sz w:val="24"/>
-          <w:szCs w:val="24"/>
-          <w:shd w:val="clear" w:color="auto" w:fill="FFFFFF"/>
-        </w:rPr>
-        <w:t>В. лексический анализ</w:t>
-      </w:r>
-    </w:p>
-    <w:p>
-      <w:pPr>
-        <w:spacing w:line="240" w:lineRule="auto"/>
-        <w:rPr>
-          <w:rFonts w:ascii="Times New Roman" w:hAnsi="Times New Roman" w:cs="Times New Roman"/>
-          <w:color w:val="00B050"/>
-          <w:sz w:val="24"/>
-          <w:szCs w:val="24"/>
-          <w:shd w:val="clear" w:color="auto" w:fill="FFFFFF"/>
-        </w:rPr>
-      </w:pPr>
-      <w:r>
-        <w:rPr>
-          <w:rFonts w:ascii="Times New Roman" w:hAnsi="Times New Roman" w:cs="Times New Roman"/>
-          <w:color w:val="00B050"/>
-          <w:sz w:val="24"/>
-          <w:szCs w:val="24"/>
-          <w:shd w:val="clear" w:color="auto" w:fill="FFFFFF"/>
-        </w:rPr>
-        <w:t>С. семантический анализ</w:t>
-      </w:r>
-    </w:p>
-    <w:p>
-      <w:pPr>
-        <w:spacing w:line="240" w:lineRule="auto"/>
-        <w:rPr>
-          <w:rFonts w:ascii="Times New Roman" w:hAnsi="Times New Roman" w:cs="Times New Roman"/>
-          <w:b/>
-          <w:color w:val="333333"/>
-          <w:sz w:val="24"/>
-          <w:szCs w:val="24"/>
-          <w:shd w:val="clear" w:color="auto" w:fill="FFFFFF"/>
-        </w:rPr>
-      </w:pPr>
-      <w:r>
-        <w:rPr>
-          <w:rFonts w:ascii="Times New Roman" w:hAnsi="Times New Roman" w:cs="Times New Roman"/>
-          <w:b/>
-          <w:color w:val="333333"/>
-          <w:sz w:val="24"/>
-          <w:szCs w:val="24"/>
-          <w:shd w:val="clear" w:color="auto" w:fill="FFFFFF"/>
-        </w:rPr>
-        <w:t xml:space="preserve">18. </w:t>
-      </w:r>
-      <w:r>
-        <w:rPr>
-          <w:rFonts w:ascii="Times New Roman" w:hAnsi="Times New Roman" w:cs="Times New Roman"/>
-          <w:b/>
-          <w:color w:val="000000" w:themeColor="text1"/>
-          <w:sz w:val="24"/>
-          <w:szCs w:val="24"/>
-        </w:rPr>
-        <w:t xml:space="preserve">Сколько ошибок обнаружит лексический анализатор в строке </w:t>
-      </w:r>
-      <w:r>
-        <w:rPr>
-          <w:rFonts w:ascii="Times New Roman" w:hAnsi="Times New Roman" w:cs="Times New Roman"/>
-          <w:b/>
-          <w:color w:val="333333"/>
-          <w:sz w:val="24"/>
-          <w:szCs w:val="24"/>
-          <w:shd w:val="clear" w:color="auto" w:fill="FFFFFF"/>
-          <w:lang w:val="en-US"/>
-        </w:rPr>
-        <w:t>fi</w:t>
-      </w:r>
-      <w:r>
-        <w:rPr>
-          <w:rFonts w:ascii="Times New Roman" w:hAnsi="Times New Roman" w:cs="Times New Roman"/>
-          <w:b/>
-          <w:color w:val="333333"/>
-          <w:sz w:val="24"/>
-          <w:szCs w:val="24"/>
-          <w:shd w:val="clear" w:color="auto" w:fill="FFFFFF"/>
-        </w:rPr>
-        <w:t xml:space="preserve"> </w:t>
-      </w:r>
-      <w:proofErr w:type="gramStart"/>
-      <w:r>
-        <w:rPr>
-          <w:rFonts w:ascii="Times New Roman" w:hAnsi="Times New Roman" w:cs="Times New Roman"/>
-          <w:b/>
-          <w:color w:val="333333"/>
-          <w:sz w:val="24"/>
-          <w:szCs w:val="24"/>
-          <w:shd w:val="clear" w:color="auto" w:fill="FFFFFF"/>
-        </w:rPr>
-        <w:t xml:space="preserve">( </w:t>
-      </w:r>
-      <w:r>
-        <w:rPr>
-          <w:rFonts w:ascii="Times New Roman" w:hAnsi="Times New Roman" w:cs="Times New Roman"/>
-          <w:b/>
-          <w:color w:val="333333"/>
-          <w:sz w:val="24"/>
-          <w:szCs w:val="24"/>
-          <w:shd w:val="clear" w:color="auto" w:fill="FFFFFF"/>
-          <w:lang w:val="en-US"/>
-        </w:rPr>
-        <w:t>a</w:t>
-      </w:r>
-      <w:proofErr w:type="gramEnd"/>
-      <w:r>
-        <w:rPr>
-          <w:rFonts w:ascii="Times New Roman" w:hAnsi="Times New Roman" w:cs="Times New Roman"/>
-          <w:b/>
-          <w:color w:val="333333"/>
-          <w:sz w:val="24"/>
-          <w:szCs w:val="24"/>
-          <w:shd w:val="clear" w:color="auto" w:fill="FFFFFF"/>
-        </w:rPr>
-        <w:t xml:space="preserve"> = </w:t>
-      </w:r>
-      <w:r>
-        <w:rPr>
-          <w:rFonts w:ascii="Times New Roman" w:hAnsi="Times New Roman" w:cs="Times New Roman"/>
-          <w:b/>
-          <w:color w:val="333333"/>
-          <w:sz w:val="24"/>
-          <w:szCs w:val="24"/>
-          <w:shd w:val="clear" w:color="auto" w:fill="FFFFFF"/>
-          <w:lang w:val="en-US"/>
-        </w:rPr>
-        <w:t>f</w:t>
-      </w:r>
-      <w:r>
-        <w:rPr>
-          <w:rFonts w:ascii="Times New Roman" w:hAnsi="Times New Roman" w:cs="Times New Roman"/>
-          <w:b/>
-          <w:color w:val="333333"/>
-          <w:sz w:val="24"/>
-          <w:szCs w:val="24"/>
-          <w:shd w:val="clear" w:color="auto" w:fill="FFFFFF"/>
-        </w:rPr>
-        <w:t>(1</w:t>
-      </w:r>
-      <w:r>
-        <w:rPr>
-          <w:rFonts w:ascii="Times New Roman" w:hAnsi="Times New Roman" w:cs="Times New Roman"/>
-          <w:b/>
-          <w:color w:val="333333"/>
-          <w:sz w:val="24"/>
-          <w:szCs w:val="24"/>
-          <w:shd w:val="clear" w:color="auto" w:fill="FFFFFF"/>
-          <w:lang w:val="en-US"/>
-        </w:rPr>
-        <w:t>x</w:t>
-      </w:r>
-      <w:r>
-        <w:rPr>
-          <w:rFonts w:ascii="Times New Roman" w:hAnsi="Times New Roman" w:cs="Times New Roman"/>
           <w:b/>
           <w:color w:val="333333"/>
           <w:sz w:val="24"/>
@@ -3117,8 +3040,6 @@
         </w:rPr>
         <w:t>1</w:t>
       </w:r>
-      <w:bookmarkStart w:id="0" w:name="_GoBack"/>
-      <w:bookmarkEnd w:id="0"/>
     </w:p>
     <w:p>
       <w:pPr>
@@ -5150,7 +5071,7 @@
 </file>
 
 <file path=word/styles.xml><?xml version="1.0" encoding="utf-8"?>
-<w:styles xmlns:mc="http://schemas.openxmlformats.org/markup-compatibility/2006" xmlns:r="http://schemas.openxmlformats.org/officeDocument/2006/relationships" xmlns:w="http://schemas.openxmlformats.org/wordprocessingml/2006/main" xmlns:w14="http://schemas.microsoft.com/office/word/2010/wordml" xmlns:w15="http://schemas.microsoft.com/office/word/2012/wordml" xmlns:w16se="http://schemas.microsoft.com/office/word/2015/wordml/symex" mc:Ignorable="w14 w15 w16se">
+<w:styles xmlns:mc="http://schemas.openxmlformats.org/markup-compatibility/2006" xmlns:r="http://schemas.openxmlformats.org/officeDocument/2006/relationships" xmlns:w="http://schemas.openxmlformats.org/wordprocessingml/2006/main" xmlns:w14="http://schemas.microsoft.com/office/word/2010/wordml" xmlns:w15="http://schemas.microsoft.com/office/word/2012/wordml" xmlns:w16cex="http://schemas.microsoft.com/office/word/2018/wordml/cex" xmlns:w16cid="http://schemas.microsoft.com/office/word/2016/wordml/cid" xmlns:w16="http://schemas.microsoft.com/office/word/2018/wordml" xmlns:w16du="http://schemas.microsoft.com/office/word/2023/wordml/word16du" xmlns:w16sdtdh="http://schemas.microsoft.com/office/word/2020/wordml/sdtdatahash" xmlns:w16sdtfl="http://schemas.microsoft.com/office/word/2024/wordml/sdtformatlock" xmlns:w16se="http://schemas.microsoft.com/office/word/2015/wordml/symex" mc:Ignorable="w14 w15 w16se w16cid w16 w16cex w16sdtdh w16sdtfl w16du">
   <w:docDefaults>
     <w:rPrDefault>
       <w:rPr>
@@ -5166,7 +5087,7 @@
       </w:pPr>
     </w:pPrDefault>
   </w:docDefaults>
-  <w:latentStyles w:defLockedState="0" w:defUIPriority="99" w:defSemiHidden="0" w:defUnhideWhenUsed="0" w:defQFormat="0" w:count="371">
+  <w:latentStyles w:defLockedState="0" w:defUIPriority="99" w:defSemiHidden="0" w:defUnhideWhenUsed="0" w:defQFormat="0" w:count="376">
     <w:lsdException w:name="Normal" w:uiPriority="0" w:qFormat="1"/>
     <w:lsdException w:name="heading 1" w:uiPriority="9" w:qFormat="1"/>
     <w:lsdException w:name="heading 2" w:semiHidden="1" w:uiPriority="9" w:unhideWhenUsed="1" w:qFormat="1"/>
@@ -5538,6 +5459,11 @@
     <w:lsdException w:name="List Table 5 Dark Accent 6" w:uiPriority="50"/>
     <w:lsdException w:name="List Table 6 Colorful Accent 6" w:uiPriority="51"/>
     <w:lsdException w:name="List Table 7 Colorful Accent 6" w:uiPriority="52"/>
+    <w:lsdException w:name="Mention" w:semiHidden="1" w:unhideWhenUsed="1"/>
+    <w:lsdException w:name="Smart Hyperlink" w:semiHidden="1" w:unhideWhenUsed="1"/>
+    <w:lsdException w:name="Hashtag" w:semiHidden="1" w:unhideWhenUsed="1"/>
+    <w:lsdException w:name="Unresolved Mention" w:semiHidden="1" w:unhideWhenUsed="1"/>
+    <w:lsdException w:name="Smart Link" w:semiHidden="1" w:unhideWhenUsed="1"/>
   </w:latentStyles>
   <w:style w:type="paragraph" w:default="1" w:styleId="a">
     <w:name w:val="Normal"/>

</xml_diff>